<commit_message>
The external-intelligence stale flag is removed: no age limit, no stale marks on searches, no stale field in the health API
IntelLimits.STALE_AFTER_HOURS, SourceHealth.is_stale, the per-batch source-health read (EvidenceAtWrite._is_stale,
IntelFeedRepository.list_source_health) and the stale argument of EvidenceFinder.find_evidence are gone, so
intel_search and the evidence_used audit row carry no stale; pending_sources and no_data stay. The planned
IntelStale alert is dropped. GET /v1/tsg/intel/health no longer returns stale (owner-approved UI contract change).

Co-Authored-By: Claude Opus 5.5 <noreply@anthropic.com>
</commit_message>
<xml_diff>
--- a/docs/Threat_Scenario_Generator_SDD_v1.1.docx
+++ b/docs/Threat_Scenario_Generator_SDD_v1.1.docx
@@ -5248,19 +5248,6 @@
           <w:bCs/>
         </w:rPr>
         <w:t xml:space="preserve">[4] Administration:</w:t>
-      </w:r>
-    </w:p>
-    <w:p>
-      <w:pPr>
-        <w:pStyle w:val="ListParagraph"/>
-        <w:numPr>
-          <w:ilvl w:val="0"/>
-          <w:numId w:val="2"/>
-        </w:numPr>
-        <w:spacing w:after="60"/>
-      </w:pPr>
-      <w:r>
-        <w:t xml:space="preserve">A source not refreshed for 48 hours marks its results as stale; they are still used.</w:t>
       </w:r>
     </w:p>
     <w:p>

</xml_diff>